<commit_message>
release: v3.7.6 and LEK export protocol
</commit_message>
<xml_diff>
--- a/data/Aufgaben/Aufgaben_Personalwirtschaft.docx
+++ b/data/Aufgaben/Aufgaben_Personalwirtschaft.docx
@@ -19409,94 +19409,457 @@
               <w:fldChar w:fldCharType="begin"/>
             </w:r>
             <w:r>
-              <w:instrText xml:space="preserve"> DATE  \@ "MMMM" </w:instrText>
+              <w:instrText xml:space="preserve"> IF </w:instrText>
+            </w:r>
+            <w:r>
+              <w:fldChar w:fldCharType="begin"/>
+            </w:r>
+            <w:r>
+              <w:instrText xml:space="preserve"> DATE \@ "M" </w:instrText>
             </w:r>
             <w:r>
               <w:fldChar w:fldCharType="separate"/>
             </w:r>
             <w:r>
+              <w:instrText>6</w:instrText>
+            </w:r>
+            <w:r>
+              <w:fldChar w:fldCharType="end"/>
+            </w:r>
+            <w:r>
+              <w:instrText xml:space="preserve"> = 1 "Februar" </w:instrText>
+            </w:r>
+            <w:r>
+              <w:fldChar w:fldCharType="begin"/>
+            </w:r>
+            <w:r>
+              <w:instrText xml:space="preserve"> IF </w:instrText>
+            </w:r>
+            <w:r>
+              <w:fldChar w:fldCharType="begin"/>
+            </w:r>
+            <w:r>
+              <w:instrText xml:space="preserve"> DATE \@ "M" </w:instrText>
+            </w:r>
+            <w:r>
+              <w:fldChar w:fldCharType="separate"/>
+            </w:r>
+            <w:r>
+              <w:instrText>6</w:instrText>
+            </w:r>
+            <w:r>
+              <w:fldChar w:fldCharType="end"/>
+            </w:r>
+            <w:r>
+              <w:instrText xml:space="preserve"> = 2 "März" </w:instrText>
+            </w:r>
+            <w:r>
+              <w:fldChar w:fldCharType="begin"/>
+            </w:r>
+            <w:r>
+              <w:instrText xml:space="preserve"> IF </w:instrText>
+            </w:r>
+            <w:r>
+              <w:fldChar w:fldCharType="begin"/>
+            </w:r>
+            <w:r>
+              <w:instrText xml:space="preserve"> DATE \@ "M" </w:instrText>
+            </w:r>
+            <w:r>
+              <w:fldChar w:fldCharType="separate"/>
+            </w:r>
+            <w:r>
+              <w:instrText>6</w:instrText>
+            </w:r>
+            <w:r>
+              <w:fldChar w:fldCharType="end"/>
+            </w:r>
+            <w:r>
+              <w:instrText xml:space="preserve"> = 3 "April" </w:instrText>
+            </w:r>
+            <w:r>
+              <w:fldChar w:fldCharType="begin"/>
+            </w:r>
+            <w:r>
+              <w:instrText xml:space="preserve"> IF </w:instrText>
+            </w:r>
+            <w:r>
+              <w:fldChar w:fldCharType="begin"/>
+            </w:r>
+            <w:r>
+              <w:instrText xml:space="preserve"> DATE \@ "M" </w:instrText>
+            </w:r>
+            <w:r>
+              <w:fldChar w:fldCharType="separate"/>
+            </w:r>
+            <w:r>
+              <w:instrText>6</w:instrText>
+            </w:r>
+            <w:r>
+              <w:fldChar w:fldCharType="end"/>
+            </w:r>
+            <w:r>
+              <w:instrText xml:space="preserve"> = 4 "Mai" </w:instrText>
+            </w:r>
+            <w:r>
+              <w:fldChar w:fldCharType="begin"/>
+            </w:r>
+            <w:r>
+              <w:instrText xml:space="preserve"> IF </w:instrText>
+            </w:r>
+            <w:r>
+              <w:fldChar w:fldCharType="begin"/>
+            </w:r>
+            <w:r>
+              <w:instrText xml:space="preserve"> DATE \@ "M" </w:instrText>
+            </w:r>
+            <w:r>
+              <w:fldChar w:fldCharType="separate"/>
+            </w:r>
+            <w:r>
+              <w:instrText>6</w:instrText>
+            </w:r>
+            <w:r>
+              <w:fldChar w:fldCharType="end"/>
+            </w:r>
+            <w:r>
+              <w:instrText xml:space="preserve"> = 5 "Juni" </w:instrText>
+            </w:r>
+            <w:r>
+              <w:fldChar w:fldCharType="begin"/>
+            </w:r>
+            <w:r>
+              <w:instrText xml:space="preserve"> IF </w:instrText>
+            </w:r>
+            <w:r>
+              <w:fldChar w:fldCharType="begin"/>
+            </w:r>
+            <w:r>
+              <w:instrText xml:space="preserve"> DATE \@ "M" </w:instrText>
+            </w:r>
+            <w:r>
+              <w:fldChar w:fldCharType="separate"/>
+            </w:r>
+            <w:r>
+              <w:instrText>6</w:instrText>
+            </w:r>
+            <w:r>
+              <w:fldChar w:fldCharType="end"/>
+            </w:r>
+            <w:r>
+              <w:instrText xml:space="preserve"> = 6 "Juli" </w:instrText>
+            </w:r>
+            <w:r>
+              <w:fldChar w:fldCharType="begin"/>
+            </w:r>
+            <w:r>
+              <w:instrText xml:space="preserve"> IF </w:instrText>
+            </w:r>
+            <w:r>
+              <w:fldChar w:fldCharType="begin"/>
+            </w:r>
+            <w:r>
+              <w:instrText xml:space="preserve"> DATE \@ "M" </w:instrText>
+            </w:r>
+            <w:r>
+              <w:fldChar w:fldCharType="separate"/>
+            </w:r>
+            <w:r>
+              <w:instrText>0</w:instrText>
+            </w:r>
+            <w:r>
+              <w:fldChar w:fldCharType="end"/>
+            </w:r>
+            <w:r>
+              <w:instrText xml:space="preserve"> = 7 "August" </w:instrText>
+            </w:r>
+            <w:r>
+              <w:fldChar w:fldCharType="begin"/>
+            </w:r>
+            <w:r>
+              <w:instrText xml:space="preserve"> IF </w:instrText>
+            </w:r>
+            <w:r>
+              <w:fldChar w:fldCharType="begin"/>
+            </w:r>
+            <w:r>
+              <w:instrText xml:space="preserve"> DATE \@ "M" </w:instrText>
+            </w:r>
+            <w:r>
+              <w:fldChar w:fldCharType="separate"/>
+            </w:r>
+            <w:r>
+              <w:instrText>0</w:instrText>
+            </w:r>
+            <w:r>
+              <w:fldChar w:fldCharType="end"/>
+            </w:r>
+            <w:r>
+              <w:instrText xml:space="preserve"> = 8 "September" </w:instrText>
+            </w:r>
+            <w:r>
+              <w:fldChar w:fldCharType="begin"/>
+            </w:r>
+            <w:r>
+              <w:instrText xml:space="preserve"> IF </w:instrText>
+            </w:r>
+            <w:r>
+              <w:fldChar w:fldCharType="begin"/>
+            </w:r>
+            <w:r>
+              <w:instrText xml:space="preserve"> DATE \@ "M" </w:instrText>
+            </w:r>
+            <w:r>
+              <w:fldChar w:fldCharType="separate"/>
+            </w:r>
+            <w:r>
+              <w:instrText>0</w:instrText>
+            </w:r>
+            <w:r>
+              <w:fldChar w:fldCharType="end"/>
+            </w:r>
+            <w:r>
+              <w:instrText xml:space="preserve"> = 9 "Oktober" </w:instrText>
+            </w:r>
+            <w:r>
+              <w:fldChar w:fldCharType="begin"/>
+            </w:r>
+            <w:r>
+              <w:instrText xml:space="preserve"> IF </w:instrText>
+            </w:r>
+            <w:r>
+              <w:fldChar w:fldCharType="begin"/>
+            </w:r>
+            <w:r>
+              <w:instrText xml:space="preserve"> DATE \@ "M" </w:instrText>
+            </w:r>
+            <w:r>
+              <w:fldChar w:fldCharType="separate"/>
+            </w:r>
+            <w:r>
+              <w:instrText>0</w:instrText>
+            </w:r>
+            <w:r>
+              <w:fldChar w:fldCharType="end"/>
+            </w:r>
+            <w:r>
+              <w:instrText xml:space="preserve"> = 10 "November" </w:instrText>
+            </w:r>
+            <w:r>
+              <w:fldChar w:fldCharType="begin"/>
+            </w:r>
+            <w:r>
+              <w:instrText xml:space="preserve"> IF </w:instrText>
+            </w:r>
+            <w:r>
+              <w:fldChar w:fldCharType="begin"/>
+            </w:r>
+            <w:r>
+              <w:instrText xml:space="preserve"> DATE \@ "M" </w:instrText>
+            </w:r>
+            <w:r>
+              <w:fldChar w:fldCharType="separate"/>
+            </w:r>
+            <w:r>
+              <w:instrText>0</w:instrText>
+            </w:r>
+            <w:r>
+              <w:fldChar w:fldCharType="end"/>
+            </w:r>
+            <w:r>
+              <w:instrText xml:space="preserve"> = 11 "Dezember" "Januar" </w:instrText>
+            </w:r>
+            <w:r>
+              <w:fldChar w:fldCharType="separate"/>
+            </w:r>
+            <w:r>
+              <w:instrText>Dezember</w:instrText>
+            </w:r>
+            <w:r>
+              <w:fldChar w:fldCharType="end"/>
+            </w:r>
+            <w:r>
+              <w:fldChar w:fldCharType="separate"/>
+            </w:r>
+            <w:r>
+              <w:instrText>November</w:instrText>
+            </w:r>
+            <w:r>
+              <w:fldChar w:fldCharType="end"/>
+            </w:r>
+            <w:r>
+              <w:fldChar w:fldCharType="separate"/>
+            </w:r>
+            <w:r>
+              <w:instrText>Oktober</w:instrText>
+            </w:r>
+            <w:r>
+              <w:fldChar w:fldCharType="end"/>
+            </w:r>
+            <w:r>
+              <w:fldChar w:fldCharType="separate"/>
+            </w:r>
+            <w:r>
+              <w:instrText>September</w:instrText>
+            </w:r>
+            <w:r>
+              <w:fldChar w:fldCharType="end"/>
+            </w:r>
+            <w:r>
+              <w:fldChar w:fldCharType="separate"/>
+            </w:r>
+            <w:r>
+              <w:instrText>August</w:instrText>
+            </w:r>
+            <w:r>
+              <w:fldChar w:fldCharType="end"/>
+            </w:r>
+            <w:r>
+              <w:fldChar w:fldCharType="separate"/>
+            </w:r>
+            <w:r>
+              <w:instrText>Juli</w:instrText>
+            </w:r>
+            <w:r>
+              <w:fldChar w:fldCharType="end"/>
+            </w:r>
+            <w:r>
+              <w:fldChar w:fldCharType="separate"/>
+            </w:r>
+            <w:r>
+              <w:instrText>Juli</w:instrText>
+            </w:r>
+            <w:r>
+              <w:fldChar w:fldCharType="end"/>
+            </w:r>
+            <w:r>
+              <w:fldChar w:fldCharType="separate"/>
+            </w:r>
+            <w:r>
+              <w:instrText>Juli</w:instrText>
+            </w:r>
+            <w:r>
+              <w:fldChar w:fldCharType="end"/>
+            </w:r>
+            <w:r>
+              <w:fldChar w:fldCharType="separate"/>
+            </w:r>
+            <w:r>
+              <w:instrText>Juli</w:instrText>
+            </w:r>
+            <w:r>
+              <w:fldChar w:fldCharType="end"/>
+            </w:r>
+            <w:r>
+              <w:fldChar w:fldCharType="separate"/>
+            </w:r>
+            <w:r>
+              <w:instrText>Juli</w:instrText>
+            </w:r>
+            <w:r>
+              <w:fldChar w:fldCharType="end"/>
+            </w:r>
+            <w:r>
+              <w:fldChar w:fldCharType="separate"/>
+            </w:r>
+            <w:r>
+              <w:t>Juli</w:t>
+            </w:r>
+            <w:r>
+              <w:fldChar w:fldCharType="end"/>
+            </w:r>
+            <w:r>
+              <w:t xml:space="preserve"> </w:t>
+            </w:r>
+            <w:r>
+              <w:fldChar w:fldCharType="begin"/>
+            </w:r>
+            <w:r>
+              <w:instrText xml:space="preserve"> DATE \@ "YYYY" </w:instrText>
+            </w:r>
+            <w:r>
+              <w:fldChar w:fldCharType="separate"/>
+            </w:r>
+            <w:r>
               <w:rPr>
                 <w:noProof/>
               </w:rPr>
-              <w:t>Juni</w:t>
+              <w:t>2026</w:t>
             </w:r>
             <w:r>
               <w:fldChar w:fldCharType="end"/>
             </w:r>
             <w:r>
+              <w:t xml:space="preserve"> für Frau Stamm. Benutzen Sie dazu die angegebenen, für das Jahr </w:t>
+            </w:r>
+            <w:r>
+              <w:fldChar w:fldCharType="begin"/>
+            </w:r>
+            <w:r>
+              <w:instrText xml:space="preserve"> DATE \@ "YYYY" </w:instrText>
+            </w:r>
+            <w:r>
+              <w:fldChar w:fldCharType="separate"/>
+            </w:r>
+            <w:r>
+              <w:rPr>
+                <w:noProof/>
+              </w:rPr>
+              <w:t>2026</w:t>
+            </w:r>
+            <w:r>
+              <w:fldChar w:fldCharType="end"/>
+            </w:r>
+            <w:r>
+              <w:t xml:space="preserve"> geltenden Werte </w:t>
+            </w:r>
+            <w:r>
+              <w:t>der</w:t>
+            </w:r>
+            <w:r>
+              <w:t xml:space="preserve"> Sozialversicherungen sowie die in der Anlage beigefügten Auszüge aus der Lohnsteuertabelle </w:t>
+            </w:r>
+            <w:r>
+              <w:fldChar w:fldCharType="begin"/>
+            </w:r>
+            <w:r>
+              <w:instrText xml:space="preserve"> DATE \@ "YYYY" </w:instrText>
+            </w:r>
+            <w:r>
+              <w:fldChar w:fldCharType="separate"/>
+            </w:r>
+            <w:r>
+              <w:rPr>
+                <w:noProof/>
+              </w:rPr>
+              <w:t>2026</w:t>
+            </w:r>
+            <w:r>
+              <w:fldChar w:fldCharType="end"/>
+            </w:r>
+            <w:r>
+              <w:t>.</w:t>
+            </w:r>
+            <w:r>
               <w:t xml:space="preserve"> </w:t>
             </w:r>
-            <w:r>
-              <w:fldChar w:fldCharType="begin"/>
-            </w:r>
-            <w:r>
-              <w:instrText xml:space="preserve"> DATE \@ "YYYY" </w:instrText>
-            </w:r>
-            <w:r>
-              <w:fldChar w:fldCharType="separate"/>
-            </w:r>
-            <w:r>
-              <w:rPr>
-                <w:noProof/>
-              </w:rPr>
-              <w:t>2026</w:t>
-            </w:r>
-            <w:r>
-              <w:fldChar w:fldCharType="end"/>
-            </w:r>
-            <w:r>
-              <w:t xml:space="preserve"> für Frau Stamm. Benutzen Sie dazu die unten angegebenen, für das Jahr </w:t>
-            </w:r>
-            <w:r>
-              <w:fldChar w:fldCharType="begin"/>
-            </w:r>
-            <w:r>
-              <w:instrText xml:space="preserve"> DATE \@ "YYYY" </w:instrText>
-            </w:r>
-            <w:r>
-              <w:fldChar w:fldCharType="separate"/>
-            </w:r>
-            <w:r>
-              <w:rPr>
-                <w:noProof/>
-              </w:rPr>
-              <w:t>2026</w:t>
-            </w:r>
-            <w:r>
-              <w:fldChar w:fldCharType="end"/>
-            </w:r>
-            <w:r>
-              <w:t xml:space="preserve"> geltenden Werte für die Sozialversicherungen sowie die in der Anlage beigefügten Auszüge aus der Lohnsteuertabelle </w:t>
-            </w:r>
-            <w:r>
-              <w:fldChar w:fldCharType="begin"/>
-            </w:r>
-            <w:r>
-              <w:instrText xml:space="preserve"> DATE \@ "YYYY" </w:instrText>
-            </w:r>
-            <w:r>
-              <w:fldChar w:fldCharType="separate"/>
-            </w:r>
-            <w:r>
-              <w:rPr>
-                <w:noProof/>
-              </w:rPr>
-              <w:t>2026</w:t>
-            </w:r>
-            <w:r>
-              <w:fldChar w:fldCharType="end"/>
-            </w:r>
-            <w:r>
-              <w:t>.</w:t>
-            </w:r>
-            <w:r>
-              <w:t xml:space="preserve"> </w:t>
-            </w:r>
           </w:p>
           <w:p/>
           <w:p>
             <w:r>
-              <w:t>In ihren ELStAM ist die Steuerklasse II eingetragen.</w:t>
+              <w:t xml:space="preserve">In ihren ELStAM </w:t>
+            </w:r>
+            <w:r>
+              <w:t>sind</w:t>
+            </w:r>
+            <w:r>
+              <w:t xml:space="preserve"> die Steuerklasse II </w:t>
+            </w:r>
+            <w:r>
+              <w:t xml:space="preserve">und 2 Kinderfreibeträge </w:t>
+            </w:r>
+            <w:r>
+              <w:t>eingetragen.</w:t>
             </w:r>
           </w:p>
           <w:p/>
@@ -19519,7 +19882,19 @@
               <w:rPr>
                 <w:szCs w:val="24"/>
               </w:rPr>
-              <w:t xml:space="preserve">Fügen Sie alle vorhandenen und die für die Abrechnung notwendigen und vorhandenen Daten, wie z. B. Namen, Steuerklasse, Religionszugehörigkeit usw. sowie die jeweiligen Prozentsätze für die Sozialversicherungen </w:t>
+              <w:t xml:space="preserve">Fügen Sie alle </w:t>
+            </w:r>
+            <w:r>
+              <w:rPr>
+                <w:szCs w:val="24"/>
+              </w:rPr>
+              <w:t>fehlenden</w:t>
+            </w:r>
+            <w:r>
+              <w:rPr>
+                <w:szCs w:val="24"/>
+              </w:rPr>
+              <w:t xml:space="preserve"> und die für die Abrechnung notwendigen Daten </w:t>
             </w:r>
             <w:r>
               <w:rPr>
@@ -19533,26 +19908,12 @@
               </w:rPr>
               <w:t>ein.</w:t>
             </w:r>
-          </w:p>
-          <w:p>
-            <w:pPr>
-              <w:tabs>
-                <w:tab w:val="right" w:pos="9072"/>
-              </w:tabs>
-              <w:rPr>
-                <w:szCs w:val="24"/>
-              </w:rPr>
-            </w:pPr>
-          </w:p>
-          <w:p>
-            <w:pPr>
-              <w:tabs>
-                <w:tab w:val="right" w:pos="9072"/>
-              </w:tabs>
-              <w:rPr>
-                <w:szCs w:val="24"/>
-              </w:rPr>
-            </w:pPr>
+            <w:r>
+              <w:rPr>
+                <w:szCs w:val="24"/>
+              </w:rPr>
+              <w:t xml:space="preserve"> </w:t>
+            </w:r>
             <w:r>
               <w:rPr>
                 <w:szCs w:val="24"/>
@@ -21832,7 +22193,6 @@
   <w:style w:type="character" w:default="1" w:styleId="Absatz-Standardschriftart">
     <w:name w:val="Default Paragraph Font"/>
     <w:uiPriority w:val="1"/>
-    <w:semiHidden/>
     <w:unhideWhenUsed/>
   </w:style>
   <w:style w:type="table" w:default="1" w:styleId="NormaleTabelle">

</xml_diff>